<commit_message>
docs: quitar guiones largos y actualizar guion (placeholders integrantes, sin recomendaciones)
</commit_message>
<xml_diff>
--- a/docs/Guion_Video.docx
+++ b/docs/Guion_Video.docx
@@ -11,7 +11,7 @@
           <w:b/>
           <w:sz w:val="32"/>
         </w:rPr>
-        <w:t>Guion — Video Entrega 3: SAT-Dengue</w:t>
+        <w:t>Guion del Video - Entrega 3: SAT-Dengue</w:t>
       </w:r>
     </w:p>
     <w:p>
@@ -21,7 +21,7 @@
       <w:r>
         <w:t>Grupo 11 · MAIA Proyecto de Desarrollo de Soluciones · Uniandes</w:t>
         <w:br/>
-        <w:t>Duración objetivo: ~9 minutos | Máximo: 10 minutos</w:t>
+        <w:t>Duracion objetivo: ~9 minutos | Maximo: 10 minutos</w:t>
       </w:r>
     </w:p>
     <w:p/>
@@ -30,16 +30,15 @@
         <w:pStyle w:val="Heading1"/>
       </w:pPr>
       <w:r>
-        <w:t>[0:00–0:45] INTRODUCCIÓN (45 s)</w:t>
+        <w:t>[0:00 - 0:45] INTRODUCCION (45 s)</w:t>
       </w:r>
     </w:p>
     <w:p>
       <w:r>
         <w:rPr>
           <w:i/>
-          <w:color w:val="4472C4"/>
         </w:rPr>
-        <w:t>[PANTALLA: Título animado 'SAT-Dengue — Sistema de Alerta Temprana' sobre fondo oscuro con mapa de Colombia]</w:t>
+        <w:t>[PANTALLA: Titulo animado "SAT-Dengue - Sistema de Alerta Temprana" sobre fondo oscuro con mapa de Colombia]</w:t>
       </w:r>
     </w:p>
     <w:p>
@@ -47,19 +46,16 @@
         <w:rPr>
           <w:b/>
         </w:rPr>
-        <w:t>NICOLÁS:</w:t>
+        <w:t xml:space="preserve">INTEGRANTE 1: </w:t>
       </w:r>
-    </w:p>
-    <w:p>
       <w:r>
-        <w:t>Cada año, miles de colombianos son afectados por el dengue. Los sistemas de vigilancia actuales reportan los casos cuando ya ocurrieron. ¿Qué pasaría si pudiéramos anticipar un brote con uno o dos meses de antelación?</w:t>
+        <w:t>Cada año, miles de colombianos son afectados por el dengue. Los sistemas de vigilancia actuales reportan los casos cuando ya ocurrieron. ¿Que pasaria si pudieramos anticipar un brote con uno o dos meses de antelacion?</w:t>
       </w:r>
     </w:p>
     <w:p>
       <w:r>
         <w:rPr>
           <w:i/>
-          <w:color w:val="4472C4"/>
         </w:rPr>
         <w:t>[PANTALLA: Fotos de Bucaramanga y Cali, luego logos SIVIGILA / Uniandes MAIA]</w:t>
       </w:r>
@@ -69,12 +65,10 @@
         <w:rPr>
           <w:b/>
         </w:rPr>
-        <w:t>NICOLÁS:</w:t>
+        <w:t xml:space="preserve">INTEGRANTE 1: </w:t>
       </w:r>
-    </w:p>
-    <w:p>
       <w:r>
-        <w:t>Somos el Grupo 11 del curso de Proyecto de Desarrollo de Soluciones de la Maestría en Inteligencia Artificial de los Andes. Nuestro proyecto es SAT-Dengue: un sistema de alerta temprana para dengue en Bucaramanga y Cali. Soy Nicolás Lara, y también forman parte del equipo Mauricio Rodríguez, Stevan Ramírez y Sergio Ballesteros.</w:t>
+        <w:t>Somos el Grupo 11 del curso de Proyecto de Desarrollo de Soluciones de la Maestria en Inteligencia Artificial de los Andes. Nuestro proyecto es SAT-Dengue: un sistema de alerta temprana para dengue en Bucaramanga y Cali.</w:t>
       </w:r>
     </w:p>
     <w:p>
@@ -82,16 +76,15 @@
         <w:pStyle w:val="Heading1"/>
       </w:pPr>
       <w:r>
-        <w:t>[0:45–2:00] PROBLEMA Y DATOS (1 min 15 s)</w:t>
+        <w:t>[0:45 - 2:00] PROBLEMA Y DATOS (1 min 15 s)</w:t>
       </w:r>
     </w:p>
     <w:p>
       <w:r>
         <w:rPr>
           <w:i/>
-          <w:color w:val="4472C4"/>
         </w:rPr>
-        <w:t>[PANTALLA: Gráfica de serie de tiempo de casos dengue clásico 2007–2024]</w:t>
+        <w:t>[PANTALLA: Grafica de serie de tiempo de casos de dengue clasico 2007-2024]</w:t>
       </w:r>
     </w:p>
     <w:p>
@@ -99,21 +92,18 @@
         <w:rPr>
           <w:b/>
         </w:rPr>
-        <w:t>STEVAN:</w:t>
+        <w:t xml:space="preserve">INTEGRANTE 2: </w:t>
       </w:r>
-    </w:p>
-    <w:p>
       <w:r>
-        <w:t>Trabajamos con datos de SIVIGILA: más de un millón y medio de registros de dengue clásico entre 2007 y 2024. La variable objetivo la definimos siguiendo el método del canal endémico de Bortman: un mes es 'brote' cuando los casos de dengue clásico superan el percentil 75 del canal endémico calculado sobre el período de referencia 2007–2022.</w:t>
+        <w:t>Trabajamos con datos de SIVIGILA: mas de un millon y medio de registros de dengue clasico entre 2007 y 2024. La variable objetivo la definimos siguiendo el metodo del canal endemico de Bortman: un mes es "brote" cuando los casos de dengue clasico superan el percentil 75 del canal endemico calculado sobre el periodo de referencia 2007-2022.</w:t>
       </w:r>
     </w:p>
     <w:p>
       <w:r>
         <w:rPr>
           <w:i/>
-          <w:color w:val="4472C4"/>
         </w:rPr>
-        <w:t>[PANTALLA: Diagrama de canal endémico con bandas P25/P75 y zonas coloreadas verde-amarillo-rojo]</w:t>
+        <w:t>[PANTALLA: Diagrama de canal endemico con bandas P25/P75 y zonas coloreadas verde-amarillo-rojo]</w:t>
       </w:r>
     </w:p>
     <w:p>
@@ -121,21 +111,18 @@
         <w:rPr>
           <w:b/>
         </w:rPr>
-        <w:t>STEVAN:</w:t>
+        <w:t xml:space="preserve">INTEGRANTE 2: </w:t>
       </w:r>
-    </w:p>
-    <w:p>
       <w:r>
-        <w:t>Esto nos da tres zonas: Normal — por debajo del P25 —, Alerta — entre P25 y P75 — y Exceso — por encima del P75. Nuestro modelo predice si el mes siguiente va a caer en zona de Exceso.</w:t>
+        <w:t>Esto nos da tres zonas: Normal, por debajo del P25; Alerta, entre P25 y P75; y Exceso, por encima del P75. Nuestro modelo predice si el mes siguiente va a caer en zona de Exceso.</w:t>
       </w:r>
     </w:p>
     <w:p>
       <w:r>
         <w:rPr>
           <w:i/>
-          <w:color w:val="4472C4"/>
         </w:rPr>
-        <w:t>[PANTALLA: Tabla de variables climáticas ERA5/CHIRPS]</w:t>
+        <w:t>[PANTALLA: Tabla de variables climaticas ERA5/CHIRPS]</w:t>
       </w:r>
     </w:p>
     <w:p>
@@ -143,12 +130,10 @@
         <w:rPr>
           <w:b/>
         </w:rPr>
-        <w:t>SERGIO:</w:t>
+        <w:t xml:space="preserve">INTEGRANTE 3: </w:t>
       </w:r>
-    </w:p>
-    <w:p>
       <w:r>
-        <w:t>Para esta entrega integramos datos climáticos de ERA5 y CHIRPS: temperatura, lluvia, agua en suelo, radiación solar y viento. La temperatura y las lluvias determinan las condiciones de reproducción del mosquito Aedes aegypti, y por tanto la incidencia de dengue semanas después.</w:t>
+        <w:t>Para esta entrega integramos datos climaticos de ERA5 y CHIRPS: temperatura, lluvia, agua en suelo, radiacion solar y viento. El razonamiento es directo: la temperatura y las lluvias determinan las condiciones de reproduccion del mosquito Aedes aegypti, y por tanto la incidencia de dengue semanas despues.</w:t>
       </w:r>
     </w:p>
     <w:p>
@@ -156,16 +141,15 @@
         <w:pStyle w:val="Heading1"/>
       </w:pPr>
       <w:r>
-        <w:t>[2:00–4:00] MODELOS Y EXPERIMENTOS (2 min)</w:t>
+        <w:t>[2:00 - 4:00] MODELOS Y EXPERIMENTOS (2 min)</w:t>
       </w:r>
     </w:p>
     <w:p>
       <w:r>
         <w:rPr>
           <w:i/>
-          <w:color w:val="4472C4"/>
         </w:rPr>
-        <w:t>[PANTALLA: Tabla comparativa de modelos en MLflow — XGBoost, LightGBM, GAM, horizontes T+1 y T+2]</w:t>
+        <w:t>[PANTALLA: Tabla comparativa de modelos en MLflow - XGBoost, LightGBM, GAM, horizontes T+1 y T+2]</w:t>
       </w:r>
     </w:p>
     <w:p>
@@ -173,21 +157,18 @@
         <w:rPr>
           <w:b/>
         </w:rPr>
-        <w:t>STEVAN:</w:t>
+        <w:t xml:space="preserve">INTEGRANTE 2: </w:t>
       </w:r>
-    </w:p>
-    <w:p>
       <w:r>
-        <w:t>Entrenamos y comparamos tres familias de modelos: XGBoost, LightGBM y GAM, para dos horizontes: T+1 — un mes adelante — y T+2 — dos meses adelante. Evaluamos con AUROC, sensibilidad y tasa de falsas alarmas.</w:t>
+        <w:t>Entrenamos y comparamos tres familias de modelos: XGBoost, LightGBM y GAM, para dos horizontes de prediccion: T+1, es decir un mes adelante, y T+2, dos meses adelante. Evaluamos con AUROC, sensibilidad y tasa de falsas alarmas.</w:t>
       </w:r>
     </w:p>
     <w:p>
       <w:r>
         <w:rPr>
           <w:i/>
-          <w:color w:val="4472C4"/>
         </w:rPr>
-        <w:t>[PANTALLA: Curva ROC del modelo campeón XGBoost T+1]</w:t>
+        <w:t>[PANTALLA: Curva ROC del modelo campeon XGBoost T+1]</w:t>
       </w:r>
     </w:p>
     <w:p>
@@ -195,21 +176,18 @@
         <w:rPr>
           <w:b/>
         </w:rPr>
-        <w:t>STEVAN:</w:t>
+        <w:t xml:space="preserve">INTEGRANTE 2: </w:t>
       </w:r>
-    </w:p>
-    <w:p>
       <w:r>
-        <w:t>El modelo campeón resultó ser XGBoost T+1, con AUROC de 0.84 en validación y 0.72 en test. Para transformar las probabilidades brutas en probabilidades bien calibradas aplicamos escalado de Platt, lo que redujo el Brier score de 0.116 a 0.072.</w:t>
+        <w:t>El modelo campeon resulto ser XGBoost T+1, con AUROC de 0.84 en validacion y 0.72 en test. Para transformar las probabilidades brutas en probabilidades bien calibradas aplicamos escalado de Platt, lo que redujo el Brier score de 0.116 a 0.072.</w:t>
       </w:r>
     </w:p>
     <w:p>
       <w:r>
         <w:rPr>
           <w:i/>
-          <w:color w:val="4472C4"/>
         </w:rPr>
-        <w:t>[PANTALLA: Pantalla MLflow mostrando experimento 'sat-dengue' y alias @champion]</w:t>
+        <w:t>[PANTALLA: Pantalla de MLflow mostrando experimento "sat-dengue" y alias @champion]</w:t>
       </w:r>
     </w:p>
     <w:p>
@@ -217,21 +195,18 @@
         <w:rPr>
           <w:b/>
         </w:rPr>
-        <w:t>STEVAN:</w:t>
+        <w:t xml:space="preserve">INTEGRANTE 2: </w:t>
       </w:r>
-    </w:p>
-    <w:p>
       <w:r>
-        <w:t>Todos los experimentos quedan trazados en MLflow. El modelo campeón tiene el alias @champion registrado en el servidor remoto.</w:t>
+        <w:t>Todos los experimentos quedan trazados en MLflow. El modelo campeon tiene el alias @champion registrado en el servidor remoto.</w:t>
       </w:r>
     </w:p>
     <w:p>
       <w:r>
         <w:rPr>
           <w:i/>
-          <w:color w:val="4472C4"/>
         </w:rPr>
-        <w:t>[PANTALLA: Feature importance con variables climáticas destacadas]</w:t>
+        <w:t>[PANTALLA: Feature importance con variables climaticas destacadas]</w:t>
       </w:r>
     </w:p>
     <w:p>
@@ -239,12 +214,10 @@
         <w:rPr>
           <w:b/>
         </w:rPr>
-        <w:t>NICOLÁS:</w:t>
+        <w:t xml:space="preserve">INTEGRANTE 1: </w:t>
       </w:r>
-    </w:p>
-    <w:p>
       <w:r>
-        <w:t>Con esta entrega incorporamos las variables climáticas al conjunto de features: nueve variables de ERA5 y CHIRPS con rezagos de hasta tres meses. El experimento enriqueció el espacio de características. Si bien el campeón de la entrega anterior se mantuvo como la mejor opción en las métricas clave, documentamos este resultado honestamente: las variables climáticas son una dirección prometedora que requiere más datos históricos para demostrar su impacto.</w:t>
+        <w:t>Con esta entrega incorporamos las variables climaticas al conjunto de features. El experimento enriquecio el espacio de caracteristicas con nueve variables de ERA5 y CHIRPS. Si bien el campeon de la entrega anterior se mantuvo como la mejor opcion en las metricas clave, documentamos este experimento honestamente: las variables climaticas son una direccion prometedora que requiere mas datos historicos para demostrar su impacto.</w:t>
       </w:r>
     </w:p>
     <w:p>
@@ -252,16 +225,15 @@
         <w:pStyle w:val="Heading1"/>
       </w:pPr>
       <w:r>
-        <w:t>[4:00–7:00] ARQUITECTURA Y DEMO (3 min)</w:t>
+        <w:t>[4:00 - 7:00] ARQUITECTURA Y DEMO (3 min)</w:t>
       </w:r>
     </w:p>
     <w:p>
       <w:r>
         <w:rPr>
           <w:i/>
-          <w:color w:val="4472C4"/>
         </w:rPr>
-        <w:t>[PANTALLA: Diagrama de arquitectura: SIVIGILA → Feature Engineering → XGBoost → FastAPI → Plotly Dash]</w:t>
+        <w:t>[PANTALLA: Diagrama de arquitectura: SIVIGILA &gt; Feature Engineering &gt; XGBoost &gt; FastAPI &gt; Plotly Dash]</w:t>
       </w:r>
     </w:p>
     <w:p>
@@ -269,19 +241,16 @@
         <w:rPr>
           <w:b/>
         </w:rPr>
-        <w:t>MAURICIO:</w:t>
+        <w:t xml:space="preserve">INTEGRANTE 4: </w:t>
       </w:r>
-    </w:p>
-    <w:p>
       <w:r>
-        <w:t>La arquitectura tiene cuatro capas: los datos de SIVIGILA pasan por un pipeline de ingeniería de características; el modelo XGBoost produce una probabilidad de brote; una API FastAPI expone esa predicción mediante endpoints REST; y el dashboard Plotly Dash consume la API para mostrar los resultados al usuario.</w:t>
+        <w:t>La arquitectura del sistema tiene cuatro capas. Los datos de SIVIGILA pasan por un pipeline de ingenieria de caracteristicas que genera la matriz de features. El modelo XGBoost consume esa matriz y produce una probabilidad de brote. Una API construida con FastAPI expone esa prediccion a traves de endpoints REST. Y el dashboard en Plotly Dash consume la API para mostrar los resultados al usuario final.</w:t>
       </w:r>
     </w:p>
     <w:p>
       <w:r>
         <w:rPr>
           <w:i/>
-          <w:color w:val="4472C4"/>
         </w:rPr>
         <w:t>[PANTALLA: Terminal mostrando docker-compose up y ambos servicios levantando]</w:t>
       </w:r>
@@ -291,10 +260,8 @@
         <w:rPr>
           <w:b/>
         </w:rPr>
-        <w:t>MAURICIO:</w:t>
+        <w:t xml:space="preserve">INTEGRANTE 4: </w:t>
       </w:r>
-    </w:p>
-    <w:p>
       <w:r>
         <w:t>Todo el stack corre con un solo comando: docker-compose up. Esto levanta dos contenedores: la API en el puerto 8000 y el dashboard en el puerto 8050.</w:t>
       </w:r>
@@ -303,9 +270,8 @@
       <w:r>
         <w:rPr>
           <w:i/>
-          <w:color w:val="4472C4"/>
         </w:rPr>
-        <w:t>[PANTALLA: Navegador abriendo http://localhost:8050 — dashboard SAT-Dengue]</w:t>
+        <w:t>[PANTALLA: Navegador abriendo http://localhost:8050 - dashboard SAT-Dengue]</w:t>
       </w:r>
     </w:p>
     <w:p>
@@ -313,21 +279,18 @@
         <w:rPr>
           <w:b/>
         </w:rPr>
-        <w:t>NICOLÁS:</w:t>
+        <w:t xml:space="preserve">INTEGRANTE 1: </w:t>
       </w:r>
-    </w:p>
-    <w:p>
       <w:r>
-        <w:t>Veamos el dashboard. Al abrirlo vemos tres pestañas: Bucaramanga, Cali y Comparación.</w:t>
+        <w:t>Veamos el dashboard. Al abrir la aplicacion vemos tres pestanas: Bucaramanga, Cali y Comparacion.</w:t>
       </w:r>
     </w:p>
     <w:p>
       <w:r>
         <w:rPr>
           <w:i/>
-          <w:color w:val="4472C4"/>
         </w:rPr>
-        <w:t>[PANTALLA: Tab Bucaramanga — fila de KPIs]</w:t>
+        <w:t>[PANTALLA: Tab Bucaramanga - fila de KPIs]</w:t>
       </w:r>
     </w:p>
     <w:p>
@@ -335,21 +298,18 @@
         <w:rPr>
           <w:b/>
         </w:rPr>
-        <w:t>NICOLÁS:</w:t>
+        <w:t xml:space="preserve">INTEGRANTE 1: </w:t>
       </w:r>
-    </w:p>
-    <w:p>
       <w:r>
-        <w:t>En la parte superior tenemos cuatro indicadores clave: total de meses analizados, meses en situación de brote, inicios de brote detectados — el primer mes de cada episodio — y el pico histórico de casos mensuales.</w:t>
+        <w:t>Empezamos con Bucaramanga. En la parte superior tenemos cuatro indicadores clave: total de meses analizados, meses en situacion de brote, inicios de brote detectados y el pico historico de casos mensuales.</w:t>
       </w:r>
     </w:p>
     <w:p>
       <w:r>
         <w:rPr>
           <w:i/>
-          <w:color w:val="4472C4"/>
         </w:rPr>
-        <w:t>[PANTALLA: Gráfica de barras + línea de probabilidad + línea de umbral]</w:t>
+        <w:t>[PANTALLA: Grafica de barras + linea de probabilidad + linea de umbral]</w:t>
       </w:r>
     </w:p>
     <w:p>
@@ -357,21 +317,18 @@
         <w:rPr>
           <w:b/>
         </w:rPr>
-        <w:t>NICOLÁS:</w:t>
+        <w:t xml:space="preserve">INTEGRANTE 1: </w:t>
       </w:r>
-    </w:p>
-    <w:p>
       <w:r>
-        <w:t>La gráfica muestra las barras de casos de dengue clásico por mes, coloreadas según la zona del canal endémico. La línea morada es la probabilidad de brote que estima el modelo, y la línea punteada es el umbral de decisión.</w:t>
+        <w:t>La grafica principal muestra las barras de casos de dengue clasico por mes, coloreadas segun la zona del canal endemico: verde para Normal, amarillo para Alerta, rojo para Exceso. La linea morada es la probabilidad de brote que estima el modelo, y la linea punteada es el umbral de decision.</w:t>
       </w:r>
     </w:p>
     <w:p>
       <w:r>
         <w:rPr>
           <w:i/>
-          <w:color w:val="4472C4"/>
         </w:rPr>
-        <w:t>[PANTALLA: Tarjeta de predicción con gauge]</w:t>
+        <w:t>[PANTALLA: Tarjeta de prediccion con medidor gauge]</w:t>
       </w:r>
     </w:p>
     <w:p>
@@ -379,19 +336,54 @@
         <w:rPr>
           <w:b/>
         </w:rPr>
-        <w:t>NICOLÁS:</w:t>
+        <w:t xml:space="preserve">INTEGRANTE 1: </w:t>
       </w:r>
-    </w:p>
-    <w:p>
       <w:r>
-        <w:t>A la derecha, la tarjeta de predicción muestra el mes siguiente. El gauge indica la probabilidad de brote. El sistema también muestra los valores de referencia P25 y P75 del canal endémico para contextualizar al epidemiólogo.</w:t>
+        <w:t>A la derecha, la tarjeta de prediccion muestra el mes siguiente. El medidor indica la probabilidad de brote para ese periodo con zona semaforo.</w:t>
       </w:r>
     </w:p>
     <w:p>
       <w:r>
         <w:rPr>
           <w:i/>
-          <w:color w:val="4472C4"/>
+        </w:rPr>
+        <w:t>[PANTALLA: Tab Cali]</w:t>
+      </w:r>
+    </w:p>
+    <w:p>
+      <w:r>
+        <w:rPr>
+          <w:b/>
+        </w:rPr>
+        <w:t xml:space="preserve">INTEGRANTE 1: </w:t>
+      </w:r>
+      <w:r>
+        <w:t>La pestana de Cali tiene la misma estructura. Vemos que los patrones estacionales difieren de Bucaramanga, lo que refleja la distinta dinamica epidemiologica de cada ciudad.</w:t>
+      </w:r>
+    </w:p>
+    <w:p>
+      <w:r>
+        <w:rPr>
+          <w:i/>
+        </w:rPr>
+        <w:t>[PANTALLA: Tab Comparacion - ambas ciudades en la misma grafica]</w:t>
+      </w:r>
+    </w:p>
+    <w:p>
+      <w:r>
+        <w:rPr>
+          <w:b/>
+        </w:rPr>
+        <w:t xml:space="preserve">INTEGRANTE 1: </w:t>
+      </w:r>
+      <w:r>
+        <w:t>La pestana de Comparacion superpone ambas ciudades para identificar periodos de alerta simultanea o desfasada.</w:t>
+      </w:r>
+    </w:p>
+    <w:p>
+      <w:r>
+        <w:rPr>
+          <w:i/>
         </w:rPr>
         <w:t>[PANTALLA: Swagger UI de la API en http://localhost:8000/docs]</w:t>
       </w:r>
@@ -401,12 +393,10 @@
         <w:rPr>
           <w:b/>
         </w:rPr>
-        <w:t>MAURICIO:</w:t>
+        <w:t xml:space="preserve">INTEGRANTE 4: </w:t>
       </w:r>
-    </w:p>
-    <w:p>
       <w:r>
-        <w:t>Por el lado de la API, el endpoint principal es POST /v2/monthly-runs: recibe un CSV mensual, valida el contrato de features, ejecuta el modelo campeón y persiste la predicción en SQLite. También hay endpoints de consulta para el historial de predicciones.</w:t>
+        <w:t>Por el lado de la API, el endpoint principal es POST /v2/monthly-runs: recibe un CSV mensual con los datos de ambas ciudades, valida el contrato de features, ejecuta el modelo campeon y persiste la prediccion. Tambien hay endpoints de consulta para obtener el historico de predicciones.</w:t>
       </w:r>
     </w:p>
     <w:p>
@@ -414,16 +404,15 @@
         <w:pStyle w:val="Heading1"/>
       </w:pPr>
       <w:r>
-        <w:t>[7:00–8:30] RESULTADOS Y CONCLUSIONES (1 min 30 s)</w:t>
+        <w:t>[7:00 - 8:30] RESULTADOS Y CONCLUSIONES (1 min 30 s)</w:t>
       </w:r>
     </w:p>
     <w:p>
       <w:r>
         <w:rPr>
           <w:i/>
-          <w:color w:val="4472C4"/>
         </w:rPr>
-        <w:t>[PANTALLA: Tabla resumen de métricas finales]</w:t>
+        <w:t>[PANTALLA: Tabla resumen de metricas finales]</w:t>
       </w:r>
     </w:p>
     <w:p>
@@ -431,21 +420,18 @@
         <w:rPr>
           <w:b/>
         </w:rPr>
-        <w:t>MAURICIO:</w:t>
+        <w:t xml:space="preserve">INTEGRANTE 4: </w:t>
       </w:r>
-    </w:p>
-    <w:p>
       <w:r>
-        <w:t>Los resultados principales: XGBoost T+1 alcanza AUROC de 0.72 en test 2023–2024. El horizonte T+2 baja a AUROC 0.69, lo que refleja la dificultad de anticipar más tiempo.</w:t>
+        <w:t>Los resultados principales: el modelo campeon XGBoost T+1 alcanza AUROC de 0.72 en el conjunto de test 2023-2024, con una sensibilidad del 68% y una tasa de falsas alarmas del 22%. El horizonte T+2 baja a AUROC 0.69, lo que refleja la dificultad natural de anticipar mas tiempo.</w:t>
       </w:r>
     </w:p>
     <w:p>
       <w:r>
         <w:rPr>
           <w:i/>
-          <w:color w:val="4472C4"/>
         </w:rPr>
-        <w:t>[PANTALLA: Gráfica de SHAP values — top features]</w:t>
+        <w:t>[PANTALLA: Grafica de SHAP values - top features]</w:t>
       </w:r>
     </w:p>
     <w:p>
@@ -453,12 +439,10 @@
         <w:rPr>
           <w:b/>
         </w:rPr>
-        <w:t>NICOLÁS:</w:t>
+        <w:t xml:space="preserve">INTEGRANTE 1: </w:t>
       </w:r>
-    </w:p>
-    <w:p>
       <w:r>
-        <w:t>El análisis de SHAP muestra que los rezagos de casos y el indicador de canal endémico son las features más importantes. Las variables climáticas entran en el top 15, confirmando su relevancia potencial.</w:t>
+        <w:t>El analisis de SHAP muestra que las features mas importantes son los rezagos de casos de las semanas previas y el indicador de canal endemico. Las variables climaticas entran en el top 15, lo que confirma su relevancia potencial con mas datos.</w:t>
       </w:r>
     </w:p>
     <w:p>
@@ -466,12 +450,10 @@
         <w:rPr>
           <w:b/>
         </w:rPr>
-        <w:t>SERGIO:</w:t>
+        <w:t xml:space="preserve">INTEGRANTE 3: </w:t>
       </w:r>
-    </w:p>
-    <w:p>
       <w:r>
-        <w:t>Reconocemos tres limitaciones: el 3.7 % de valores faltantes en datos climáticos recientes, una brecha entre AUROC de validación y test que sugiere algo de sobreajuste, y la cobertura limitada a dos ciudades piloto.</w:t>
+        <w:t>Reconocemos tres limitaciones principales. Primero, el 3.7% de valores faltantes en los datos climaticos. Segundo, la brecha entre AUROC de validacion y test sugiere algo de sobreajuste. Tercero, el sistema cubre solo dos ciudades piloto.</w:t>
       </w:r>
     </w:p>
     <w:p>
@@ -479,12 +461,10 @@
         <w:rPr>
           <w:b/>
         </w:rPr>
-        <w:t>STEVAN:</w:t>
+        <w:t xml:space="preserve">INTEGRANTE 2: </w:t>
       </w:r>
-    </w:p>
-    <w:p>
       <w:r>
-        <w:t>Como trabajo futuro: incorporar más municipios, automatizar el pipeline de actualización mensual con datos de SIVIGILA, y hacer una validación prospectiva comparando las predicciones del modelo contra los casos reales a medida que ocurran.</w:t>
+        <w:t>Como trabajo futuro planteamos: incorporar mas municipios, automatizar el pipeline de actualizacion mensual con los datos de SIVIGILA, y hacer una validacion prospectiva comparando las predicciones del modelo contra los casos reales a medida que ocurran en 2026.</w:t>
       </w:r>
     </w:p>
     <w:p>
@@ -492,14 +472,13 @@
         <w:pStyle w:val="Heading1"/>
       </w:pPr>
       <w:r>
-        <w:t>[8:30–9:00] CIERRE (30 s)</w:t>
+        <w:t>[8:30 - 9:00] CIERRE (30 s)</w:t>
       </w:r>
     </w:p>
     <w:p>
       <w:r>
         <w:rPr>
           <w:i/>
-          <w:color w:val="4472C4"/>
         </w:rPr>
         <w:t>[PANTALLA: Diapositiva de cierre con nombres del equipo y URL del repo]</w:t>
       </w:r>
@@ -509,21 +488,23 @@
         <w:rPr>
           <w:b/>
         </w:rPr>
-        <w:t>NICOLÁS:</w:t>
+        <w:t xml:space="preserve">INTEGRANTE 1: </w:t>
       </w:r>
-    </w:p>
-    <w:p>
       <w:r>
-        <w:t>Agradecemos a nuestro experto de dominio, Carlos Bravo Vega, por su orientación durante todo el proyecto. El código, los datos versionados con DVC y los experimentos en MLflow están disponibles en github.com/j-mauro-r/microproyecto-tema3. Gracias por su atención.</w:t>
+        <w:t>Agradecemos a nuestro experto de dominio, Carlos Bravo Vega, por su orientacion durante todo el proyecto. El codigo, los datos versionados con DVC y los experimentos en MLflow estan disponibles en: github.com/j-mauro-r/microproyecto-tema3. Gracias por su atencion.</w:t>
       </w:r>
     </w:p>
     <w:p>
       <w:r>
         <w:rPr>
           <w:i/>
-          <w:color w:val="4472C4"/>
         </w:rPr>
-        <w:t>[PANTALLA: Logo MAIA Uniandes + 'SAT-Dengue · Grupo 11 · 2026']</w:t>
+        <w:t>[PANTALLA: Logo MAIA Uniandes + "SAT-Dengue - Grupo 11 - 2026"]</w:t>
+      </w:r>
+    </w:p>
+    <w:p>
+      <w:r>
+        <w:br w:type="page"/>
       </w:r>
     </w:p>
     <w:p>
@@ -531,7 +512,7 @@
         <w:pStyle w:val="Heading1"/>
       </w:pPr>
       <w:r>
-        <w:t>Notas de producción</w:t>
+        <w:t>Tabla de produccion</w:t>
       </w:r>
     </w:p>
     <w:tbl>
@@ -571,7 +552,7 @@
               <w:rPr>
                 <w:b/>
               </w:rPr>
-              <w:t>Duración</w:t>
+              <w:t>Duracion</w:t>
             </w:r>
           </w:p>
         </w:tc>
@@ -585,7 +566,7 @@
               <w:rPr>
                 <w:b/>
               </w:rPr>
-              <w:t>Quién habla</w:t>
+              <w:t>Integrante</w:t>
             </w:r>
           </w:p>
         </w:tc>
@@ -611,7 +592,7 @@
           </w:tcPr>
           <w:p>
             <w:r>
-              <w:t>Introducción</w:t>
+              <w:t>Introduccion</w:t>
             </w:r>
           </w:p>
         </w:tc>
@@ -631,7 +612,7 @@
           </w:tcPr>
           <w:p>
             <w:r>
-              <w:t>Nicolás</w:t>
+              <w:t>Integrante 1</w:t>
             </w:r>
           </w:p>
         </w:tc>
@@ -641,7 +622,7 @@
           </w:tcPr>
           <w:p>
             <w:r>
-              <w:t>Título + mapa Colombia</w:t>
+              <w:t>Titulo + mapa Colombia</w:t>
             </w:r>
           </w:p>
         </w:tc>
@@ -673,7 +654,7 @@
           </w:tcPr>
           <w:p>
             <w:r>
-              <w:t>Stevan + Sergio</w:t>
+              <w:t>Integrante 2 + Integrante 3</w:t>
             </w:r>
           </w:p>
         </w:tc>
@@ -683,7 +664,7 @@
           </w:tcPr>
           <w:p>
             <w:r>
-              <w:t>Canal endémico + tabla clima</w:t>
+              <w:t>Canal endemico + tabla clima</w:t>
             </w:r>
           </w:p>
         </w:tc>
@@ -715,7 +696,7 @@
           </w:tcPr>
           <w:p>
             <w:r>
-              <w:t>Stevan + Nicolás</w:t>
+              <w:t>Integrante 2 + Integrante 1</w:t>
             </w:r>
           </w:p>
         </w:tc>
@@ -757,7 +738,7 @@
           </w:tcPr>
           <w:p>
             <w:r>
-              <w:t>Mauricio + Nicolás</w:t>
+              <w:t>Integrante 4 + Integrante 1</w:t>
             </w:r>
           </w:p>
         </w:tc>
@@ -799,7 +780,7 @@
           </w:tcPr>
           <w:p>
             <w:r>
-              <w:t>Mauricio + Sergio + Stevan</w:t>
+              <w:t>Integrante 4 + Integrante 3 + Integrante 2</w:t>
             </w:r>
           </w:p>
         </w:tc>
@@ -809,7 +790,7 @@
           </w:tcPr>
           <w:p>
             <w:r>
-              <w:t>Tabla métricas + SHAP</w:t>
+              <w:t>Tabla metricas + SHAP</w:t>
             </w:r>
           </w:p>
         </w:tc>
@@ -841,7 +822,7 @@
           </w:tcPr>
           <w:p>
             <w:r>
-              <w:t>Nicolás</w:t>
+              <w:t>Integrante 1</w:t>
             </w:r>
           </w:p>
         </w:tc>
@@ -895,47 +876,6 @@
         </w:tc>
       </w:tr>
     </w:tbl>
-    <w:p/>
-    <w:p>
-      <w:pPr>
-        <w:pStyle w:val="Heading2"/>
-      </w:pPr>
-      <w:r>
-        <w:t>Recomendaciones de grabación</w:t>
-      </w:r>
-    </w:p>
-    <w:p>
-      <w:pPr>
-        <w:pStyle w:val="ListBullet"/>
-      </w:pPr>
-      <w:r>
-        <w:t>Grabar la demo del dashboard en vivo (no con capturas estáticas) — muestra el gauge animado y los colores reales.</w:t>
-      </w:r>
-    </w:p>
-    <w:p>
-      <w:pPr>
-        <w:pStyle w:val="ListBullet"/>
-      </w:pPr>
-      <w:r>
-        <w:t>Usar OBS Studio o Loom para capturar pantalla + cámara simultáneamente.</w:t>
-      </w:r>
-    </w:p>
-    <w:p>
-      <w:pPr>
-        <w:pStyle w:val="ListBullet"/>
-      </w:pPr>
-      <w:r>
-        <w:t>Ensayar la sección de demo (4:00–7:00) antes de grabar — es la más propensa a errores.</w:t>
-      </w:r>
-    </w:p>
-    <w:p>
-      <w:pPr>
-        <w:pStyle w:val="ListBullet"/>
-      </w:pPr>
-      <w:r>
-        <w:t>Subir a YouTube como 'No listado' o Google Drive antes de publicar en el padlet del curso.</w:t>
-      </w:r>
-    </w:p>
     <w:sectPr>
       <w:pgSz w:w="12240" w:h="15840"/>
       <w:pgMar w:top="1440" w:right="1800" w:bottom="1440" w:left="1800" w:header="720" w:footer="720" w:gutter="0"/>

</xml_diff>

<commit_message>
docs: quitar guiones, seccion E2 y prefijos de integrante
- Reemplazar ' - ' por ':' o 'dot' en titulos y encabezados
- Reporte: eliminar seccion 'Cambios principales respecto a Entrega 2' y su tabla
- Guion: eliminar prefijos INTEGRANTE X de parrafos narrativos
- Manuales: corregir titulos y encabezados de troubleshooting
</commit_message>
<xml_diff>
--- a/docs/Guion_Video.docx
+++ b/docs/Guion_Video.docx
@@ -11,7 +11,7 @@
           <w:b/>
           <w:sz w:val="32"/>
         </w:rPr>
-        <w:t>Guion del Video - Entrega 3: SAT-Dengue</w:t>
+        <w:t>Guion del Video · Entrega 3: SAT-Dengue</w:t>
       </w:r>
     </w:p>
     <w:p>
@@ -30,7 +30,7 @@
         <w:pStyle w:val="Heading1"/>
       </w:pPr>
       <w:r>
-        <w:t>[0:00 - 0:45] INTRODUCCION (45 s)</w:t>
+        <w:t>[0:00–0:45] INTRODUCCION (45 s)</w:t>
       </w:r>
     </w:p>
     <w:p>
@@ -38,7 +38,7 @@
         <w:rPr>
           <w:i/>
         </w:rPr>
-        <w:t>[PANTALLA: Titulo animado "SAT-Dengue - Sistema de Alerta Temprana" sobre fondo oscuro con mapa de Colombia]</w:t>
+        <w:t>[PANTALLA: Titulo animado "SAT-Dengue: Sistema de Alerta Temprana" sobre fondo oscuro con mapa de Colombia]</w:t>
       </w:r>
     </w:p>
     <w:p>
@@ -46,11 +46,9 @@
         <w:rPr>
           <w:b/>
         </w:rPr>
-        <w:t xml:space="preserve">INTEGRANTE 1: </w:t>
-      </w:r>
-      <w:r>
         <w:t>Cada año, miles de colombianos son afectados por el dengue. Los sistemas de vigilancia actuales reportan los casos cuando ya ocurrieron. ¿Que pasaria si pudieramos anticipar un brote con uno o dos meses de antelacion?</w:t>
       </w:r>
+      <w:r/>
     </w:p>
     <w:p>
       <w:r>
@@ -65,18 +63,16 @@
         <w:rPr>
           <w:b/>
         </w:rPr>
-        <w:t xml:space="preserve">INTEGRANTE 1: </w:t>
-      </w:r>
-      <w:r>
         <w:t>Somos el Grupo 11 del curso de Proyecto de Desarrollo de Soluciones de la Maestria en Inteligencia Artificial de los Andes. Nuestro proyecto es SAT-Dengue: un sistema de alerta temprana para dengue en Bucaramanga y Cali.</w:t>
       </w:r>
+      <w:r/>
     </w:p>
     <w:p>
       <w:pPr>
         <w:pStyle w:val="Heading1"/>
       </w:pPr>
       <w:r>
-        <w:t>[0:45 - 2:00] PROBLEMA Y DATOS (1 min 15 s)</w:t>
+        <w:t>[0:45–2:00] PROBLEMA Y DATOS (1 min 15 s)</w:t>
       </w:r>
     </w:p>
     <w:p>
@@ -92,11 +88,9 @@
         <w:rPr>
           <w:b/>
         </w:rPr>
-        <w:t xml:space="preserve">INTEGRANTE 2: </w:t>
-      </w:r>
-      <w:r>
         <w:t>Trabajamos con datos de SIVIGILA: mas de un millon y medio de registros de dengue clasico entre 2007 y 2024. La variable objetivo la definimos siguiendo el metodo del canal endemico de Bortman: un mes es "brote" cuando los casos de dengue clasico superan el percentil 75 del canal endemico calculado sobre el periodo de referencia 2007-2022.</w:t>
       </w:r>
+      <w:r/>
     </w:p>
     <w:p>
       <w:r>
@@ -111,11 +105,9 @@
         <w:rPr>
           <w:b/>
         </w:rPr>
-        <w:t xml:space="preserve">INTEGRANTE 2: </w:t>
-      </w:r>
-      <w:r>
         <w:t>Esto nos da tres zonas: Normal, por debajo del P25; Alerta, entre P25 y P75; y Exceso, por encima del P75. Nuestro modelo predice si el mes siguiente va a caer en zona de Exceso.</w:t>
       </w:r>
+      <w:r/>
     </w:p>
     <w:p>
       <w:r>
@@ -130,18 +122,16 @@
         <w:rPr>
           <w:b/>
         </w:rPr>
-        <w:t xml:space="preserve">INTEGRANTE 3: </w:t>
-      </w:r>
-      <w:r>
         <w:t>Para esta entrega integramos datos climaticos de ERA5 y CHIRPS: temperatura, lluvia, agua en suelo, radiacion solar y viento. El razonamiento es directo: la temperatura y las lluvias determinan las condiciones de reproduccion del mosquito Aedes aegypti, y por tanto la incidencia de dengue semanas despues.</w:t>
       </w:r>
+      <w:r/>
     </w:p>
     <w:p>
       <w:pPr>
         <w:pStyle w:val="Heading1"/>
       </w:pPr>
       <w:r>
-        <w:t>[2:00 - 4:00] MODELOS Y EXPERIMENTOS (2 min)</w:t>
+        <w:t>[2:00–4:00] MODELOS Y EXPERIMENTOS (2 min)</w:t>
       </w:r>
     </w:p>
     <w:p>
@@ -149,7 +139,7 @@
         <w:rPr>
           <w:i/>
         </w:rPr>
-        <w:t>[PANTALLA: Tabla comparativa de modelos en MLflow - XGBoost, LightGBM, GAM, horizontes T+1 y T+2]</w:t>
+        <w:t>[PANTALLA: Tabla comparativa de modelos en MLflow: XGBoost, LightGBM, GAM, horizontes T+1 y T+2]</w:t>
       </w:r>
     </w:p>
     <w:p>
@@ -157,11 +147,9 @@
         <w:rPr>
           <w:b/>
         </w:rPr>
-        <w:t xml:space="preserve">INTEGRANTE 2: </w:t>
-      </w:r>
-      <w:r>
         <w:t>Entrenamos y comparamos tres familias de modelos: XGBoost, LightGBM y GAM, para dos horizontes de prediccion: T+1, es decir un mes adelante, y T+2, dos meses adelante. Evaluamos con AUROC, sensibilidad y tasa de falsas alarmas.</w:t>
       </w:r>
+      <w:r/>
     </w:p>
     <w:p>
       <w:r>
@@ -176,11 +164,9 @@
         <w:rPr>
           <w:b/>
         </w:rPr>
-        <w:t xml:space="preserve">INTEGRANTE 2: </w:t>
-      </w:r>
-      <w:r>
         <w:t>El modelo campeon resulto ser XGBoost T+1, con AUROC de 0.84 en validacion y 0.72 en test. Para transformar las probabilidades brutas en probabilidades bien calibradas aplicamos escalado de Platt, lo que redujo el Brier score de 0.116 a 0.072.</w:t>
       </w:r>
+      <w:r/>
     </w:p>
     <w:p>
       <w:r>
@@ -195,11 +181,9 @@
         <w:rPr>
           <w:b/>
         </w:rPr>
-        <w:t xml:space="preserve">INTEGRANTE 2: </w:t>
-      </w:r>
-      <w:r>
         <w:t>Todos los experimentos quedan trazados en MLflow. El modelo campeon tiene el alias @champion registrado en el servidor remoto.</w:t>
       </w:r>
+      <w:r/>
     </w:p>
     <w:p>
       <w:r>
@@ -214,18 +198,16 @@
         <w:rPr>
           <w:b/>
         </w:rPr>
-        <w:t xml:space="preserve">INTEGRANTE 1: </w:t>
-      </w:r>
-      <w:r>
         <w:t>Con esta entrega incorporamos las variables climaticas al conjunto de features. El experimento enriquecio el espacio de caracteristicas con nueve variables de ERA5 y CHIRPS. Si bien el campeon de la entrega anterior se mantuvo como la mejor opcion en las metricas clave, documentamos este experimento honestamente: las variables climaticas son una direccion prometedora que requiere mas datos historicos para demostrar su impacto.</w:t>
       </w:r>
+      <w:r/>
     </w:p>
     <w:p>
       <w:pPr>
         <w:pStyle w:val="Heading1"/>
       </w:pPr>
       <w:r>
-        <w:t>[4:00 - 7:00] ARQUITECTURA Y DEMO (3 min)</w:t>
+        <w:t>[4:00–7:00] ARQUITECTURA Y DEMO (3 min)</w:t>
       </w:r>
     </w:p>
     <w:p>
@@ -241,11 +223,9 @@
         <w:rPr>
           <w:b/>
         </w:rPr>
-        <w:t xml:space="preserve">INTEGRANTE 4: </w:t>
-      </w:r>
-      <w:r>
         <w:t>La arquitectura del sistema tiene cuatro capas. Los datos de SIVIGILA pasan por un pipeline de ingenieria de caracteristicas que genera la matriz de features. El modelo XGBoost consume esa matriz y produce una probabilidad de brote. Una API construida con FastAPI expone esa prediccion a traves de endpoints REST. Y el dashboard en Plotly Dash consume la API para mostrar los resultados al usuario final.</w:t>
       </w:r>
+      <w:r/>
     </w:p>
     <w:p>
       <w:r>
@@ -260,18 +240,16 @@
         <w:rPr>
           <w:b/>
         </w:rPr>
-        <w:t xml:space="preserve">INTEGRANTE 4: </w:t>
-      </w:r>
-      <w:r>
         <w:t>Todo el stack corre con un solo comando: docker-compose up. Esto levanta dos contenedores: la API en el puerto 8000 y el dashboard en el puerto 8050.</w:t>
       </w:r>
+      <w:r/>
     </w:p>
     <w:p>
       <w:r>
         <w:rPr>
           <w:i/>
         </w:rPr>
-        <w:t>[PANTALLA: Navegador abriendo http://localhost:8050 - dashboard SAT-Dengue]</w:t>
+        <w:t>[PANTALLA: Navegador abriendo http://localhost:8050: dashboard SAT-Dengue]</w:t>
       </w:r>
     </w:p>
     <w:p>
@@ -279,18 +257,16 @@
         <w:rPr>
           <w:b/>
         </w:rPr>
-        <w:t xml:space="preserve">INTEGRANTE 1: </w:t>
-      </w:r>
-      <w:r>
         <w:t>Veamos el dashboard. Al abrir la aplicacion vemos tres pestanas: Bucaramanga, Cali y Comparacion.</w:t>
       </w:r>
+      <w:r/>
     </w:p>
     <w:p>
       <w:r>
         <w:rPr>
           <w:i/>
         </w:rPr>
-        <w:t>[PANTALLA: Tab Bucaramanga - fila de KPIs]</w:t>
+        <w:t>[PANTALLA: Tab Bucaramanga: fila de KPIs]</w:t>
       </w:r>
     </w:p>
     <w:p>
@@ -298,11 +274,9 @@
         <w:rPr>
           <w:b/>
         </w:rPr>
-        <w:t xml:space="preserve">INTEGRANTE 1: </w:t>
-      </w:r>
-      <w:r>
         <w:t>Empezamos con Bucaramanga. En la parte superior tenemos cuatro indicadores clave: total de meses analizados, meses en situacion de brote, inicios de brote detectados y el pico historico de casos mensuales.</w:t>
       </w:r>
+      <w:r/>
     </w:p>
     <w:p>
       <w:r>
@@ -317,11 +291,9 @@
         <w:rPr>
           <w:b/>
         </w:rPr>
-        <w:t xml:space="preserve">INTEGRANTE 1: </w:t>
-      </w:r>
-      <w:r>
         <w:t>La grafica principal muestra las barras de casos de dengue clasico por mes, coloreadas segun la zona del canal endemico: verde para Normal, amarillo para Alerta, rojo para Exceso. La linea morada es la probabilidad de brote que estima el modelo, y la linea punteada es el umbral de decision.</w:t>
       </w:r>
+      <w:r/>
     </w:p>
     <w:p>
       <w:r>
@@ -336,11 +308,9 @@
         <w:rPr>
           <w:b/>
         </w:rPr>
-        <w:t xml:space="preserve">INTEGRANTE 1: </w:t>
-      </w:r>
-      <w:r>
         <w:t>A la derecha, la tarjeta de prediccion muestra el mes siguiente. El medidor indica la probabilidad de brote para ese periodo con zona semaforo.</w:t>
       </w:r>
+      <w:r/>
     </w:p>
     <w:p>
       <w:r>
@@ -355,18 +325,16 @@
         <w:rPr>
           <w:b/>
         </w:rPr>
-        <w:t xml:space="preserve">INTEGRANTE 1: </w:t>
-      </w:r>
-      <w:r>
         <w:t>La pestana de Cali tiene la misma estructura. Vemos que los patrones estacionales difieren de Bucaramanga, lo que refleja la distinta dinamica epidemiologica de cada ciudad.</w:t>
       </w:r>
+      <w:r/>
     </w:p>
     <w:p>
       <w:r>
         <w:rPr>
           <w:i/>
         </w:rPr>
-        <w:t>[PANTALLA: Tab Comparacion - ambas ciudades en la misma grafica]</w:t>
+        <w:t>[PANTALLA: Tab Comparacion: ambas ciudades en la misma grafica]</w:t>
       </w:r>
     </w:p>
     <w:p>
@@ -374,11 +342,9 @@
         <w:rPr>
           <w:b/>
         </w:rPr>
-        <w:t xml:space="preserve">INTEGRANTE 1: </w:t>
-      </w:r>
-      <w:r>
         <w:t>La pestana de Comparacion superpone ambas ciudades para identificar periodos de alerta simultanea o desfasada.</w:t>
       </w:r>
+      <w:r/>
     </w:p>
     <w:p>
       <w:r>
@@ -393,18 +359,16 @@
         <w:rPr>
           <w:b/>
         </w:rPr>
-        <w:t xml:space="preserve">INTEGRANTE 4: </w:t>
-      </w:r>
-      <w:r>
         <w:t>Por el lado de la API, el endpoint principal es POST /v2/monthly-runs: recibe un CSV mensual con los datos de ambas ciudades, valida el contrato de features, ejecuta el modelo campeon y persiste la prediccion. Tambien hay endpoints de consulta para obtener el historico de predicciones.</w:t>
       </w:r>
+      <w:r/>
     </w:p>
     <w:p>
       <w:pPr>
         <w:pStyle w:val="Heading1"/>
       </w:pPr>
       <w:r>
-        <w:t>[7:00 - 8:30] RESULTADOS Y CONCLUSIONES (1 min 30 s)</w:t>
+        <w:t>[7:00–8:30] RESULTADOS Y CONCLUSIONES (1 min 30 s)</w:t>
       </w:r>
     </w:p>
     <w:p>
@@ -420,18 +384,16 @@
         <w:rPr>
           <w:b/>
         </w:rPr>
-        <w:t xml:space="preserve">INTEGRANTE 4: </w:t>
-      </w:r>
-      <w:r>
         <w:t>Los resultados principales: el modelo campeon XGBoost T+1 alcanza AUROC de 0.72 en el conjunto de test 2023-2024, con una sensibilidad del 68% y una tasa de falsas alarmas del 22%. El horizonte T+2 baja a AUROC 0.69, lo que refleja la dificultad natural de anticipar mas tiempo.</w:t>
       </w:r>
+      <w:r/>
     </w:p>
     <w:p>
       <w:r>
         <w:rPr>
           <w:i/>
         </w:rPr>
-        <w:t>[PANTALLA: Grafica de SHAP values - top features]</w:t>
+        <w:t>[PANTALLA: Grafica de SHAP values: top features]</w:t>
       </w:r>
     </w:p>
     <w:p>
@@ -439,40 +401,34 @@
         <w:rPr>
           <w:b/>
         </w:rPr>
-        <w:t xml:space="preserve">INTEGRANTE 1: </w:t>
-      </w:r>
-      <w:r>
         <w:t>El analisis de SHAP muestra que las features mas importantes son los rezagos de casos de las semanas previas y el indicador de canal endemico. Las variables climaticas entran en el top 15, lo que confirma su relevancia potencial con mas datos.</w:t>
       </w:r>
+      <w:r/>
     </w:p>
     <w:p>
       <w:r>
         <w:rPr>
           <w:b/>
         </w:rPr>
-        <w:t xml:space="preserve">INTEGRANTE 3: </w:t>
-      </w:r>
-      <w:r>
         <w:t>Reconocemos tres limitaciones principales. Primero, el 3.7% de valores faltantes en los datos climaticos. Segundo, la brecha entre AUROC de validacion y test sugiere algo de sobreajuste. Tercero, el sistema cubre solo dos ciudades piloto.</w:t>
       </w:r>
+      <w:r/>
     </w:p>
     <w:p>
       <w:r>
         <w:rPr>
           <w:b/>
         </w:rPr>
-        <w:t xml:space="preserve">INTEGRANTE 2: </w:t>
-      </w:r>
-      <w:r>
         <w:t>Como trabajo futuro planteamos: incorporar mas municipios, automatizar el pipeline de actualizacion mensual con los datos de SIVIGILA, y hacer una validacion prospectiva comparando las predicciones del modelo contra los casos reales a medida que ocurran en 2026.</w:t>
       </w:r>
+      <w:r/>
     </w:p>
     <w:p>
       <w:pPr>
         <w:pStyle w:val="Heading1"/>
       </w:pPr>
       <w:r>
-        <w:t>[8:30 - 9:00] CIERRE (30 s)</w:t>
+        <w:t>[8:30–9:00] CIERRE (30 s)</w:t>
       </w:r>
     </w:p>
     <w:p>
@@ -488,18 +444,16 @@
         <w:rPr>
           <w:b/>
         </w:rPr>
-        <w:t xml:space="preserve">INTEGRANTE 1: </w:t>
-      </w:r>
-      <w:r>
         <w:t>Agradecemos a nuestro experto de dominio, Carlos Bravo Vega, por su orientacion durante todo el proyecto. El codigo, los datos versionados con DVC y los experimentos en MLflow estan disponibles en: github.com/j-mauro-r/microproyecto-tema3. Gracias por su atencion.</w:t>
       </w:r>
+      <w:r/>
     </w:p>
     <w:p>
       <w:r>
         <w:rPr>
           <w:i/>
         </w:rPr>
-        <w:t>[PANTALLA: Logo MAIA Uniandes + "SAT-Dengue - Grupo 11 - 2026"]</w:t>
+        <w:t>[PANTALLA: Logo MAIA Uniandes + "SAT-Dengue: Grupo 11: 2026"]</w:t>
       </w:r>
     </w:p>
     <w:p>

</xml_diff>